<commit_message>
fix: make NPC exploration interactions playable
</commit_message>
<xml_diff>
--- a/docs/design/Sources/LEDS-SFD-EXP-001_Exploration_acteurs_et_declencheurs_v1.0.docx
+++ b/docs/design/Sources/LEDS-SFD-EXP-001_Exploration_acteurs_et_declencheurs_v1.0.docx
@@ -1757,7 +1757,39 @@
           <w:color w:val="1C2027"/>
           <w:sz w:val="21"/>
         </w:rPr>
-        <w:t>distance. Le joueur ne pénètre pas sur la case du PNJ.</w:t>
+        <w:t>distance. Une case occupée par un PNJ peut être traversée au milieu d'un</w:t>
+      </w:r>
+    </w:p>
+    <w:p>
+      <w:pPr>
+        <w:spacing w:after="100"/>
+        <w:ind w:left="0" w:firstLine="0"/>
+      </w:pPr>
+      <w:r>
+        <w:rPr>
+          <w:rFonts w:ascii="Georgia" w:hAnsi="Georgia"/>
+          <w:b w:val="0"/>
+          <w:i w:val="0"/>
+          <w:color w:val="1C2027"/>
+          <w:sz w:val="21"/>
+        </w:rPr>
+        <w:t>trajet afin de ne jamais condamner un couloir, mais elle ne peut pas être la</w:t>
+      </w:r>
+    </w:p>
+    <w:p>
+      <w:pPr>
+        <w:spacing w:after="100"/>
+        <w:ind w:left="0" w:firstLine="0"/>
+      </w:pPr>
+      <w:r>
+        <w:rPr>
+          <w:rFonts w:ascii="Georgia" w:hAnsi="Georgia"/>
+          <w:b w:val="0"/>
+          <w:i w:val="0"/>
+          <w:color w:val="1C2027"/>
+          <w:sz w:val="21"/>
+        </w:rPr>
+        <w:t>destination finale du joueur.</w:t>
       </w:r>
     </w:p>
     <w:p>
@@ -3465,6 +3497,58 @@
           <w:color w:val="1C2027"/>
           <w:sz w:val="21"/>
         </w:rPr>
+        <w:t>CA-EXP-003b</w:t>
+      </w:r>
+      <w:r>
+        <w:rPr>
+          <w:rFonts w:ascii="Georgia" w:hAnsi="Georgia"/>
+          <w:b w:val="0"/>
+          <w:i w:val="0"/>
+          <w:color w:val="1C2027"/>
+          <w:sz w:val="21"/>
+        </w:rPr>
+        <w:t xml:space="preserve"> — Une destination libre située derrière un PNJ dans un couloir</w:t>
+      </w:r>
+    </w:p>
+    <w:p>
+      <w:pPr>
+        <w:spacing w:after="100"/>
+        <w:ind w:left="0" w:firstLine="0"/>
+      </w:pPr>
+      <w:r>
+        <w:rPr>
+          <w:rFonts w:ascii="Georgia" w:hAnsi="Georgia"/>
+          <w:b w:val="0"/>
+          <w:i w:val="0"/>
+          <w:color w:val="1C2027"/>
+          <w:sz w:val="21"/>
+        </w:rPr>
+        <w:t>reste atteignable ; le trajet traverse la case occupée sans y terminer.</w:t>
+      </w:r>
+    </w:p>
+    <w:p>
+      <w:pPr>
+        <w:spacing w:after="100"/>
+        <w:ind w:left="317" w:hanging="202"/>
+      </w:pPr>
+      <w:r>
+        <w:rPr>
+          <w:rFonts w:ascii="Georgia" w:hAnsi="Georgia"/>
+          <w:b/>
+          <w:i w:val="0"/>
+          <w:color w:val="525C6C"/>
+          <w:sz w:val="20"/>
+        </w:rPr>
+        <w:t xml:space="preserve">—  </w:t>
+      </w:r>
+      <w:r>
+        <w:rPr>
+          <w:rFonts w:ascii="Georgia" w:hAnsi="Georgia"/>
+          <w:b/>
+          <w:i w:val="0"/>
+          <w:color w:val="1C2027"/>
+          <w:sz w:val="21"/>
+        </w:rPr>
         <w:t>CA-EXP-004</w:t>
       </w:r>
       <w:r>
@@ -3797,7 +3881,23 @@
           <w:color w:val="1C2027"/>
           <w:sz w:val="21"/>
         </w:rPr>
-        <w:t>Refonte des dialogues ou du contenu narratif des PNJ.</w:t>
+        <w:t>Réécriture du contenu narratif des PNJ ; l'interaction réutilise les graphes</w:t>
+      </w:r>
+    </w:p>
+    <w:p>
+      <w:pPr>
+        <w:spacing w:after="100"/>
+        <w:ind w:left="0" w:firstLine="0"/>
+      </w:pPr>
+      <w:r>
+        <w:rPr>
+          <w:rFonts w:ascii="Georgia" w:hAnsi="Georgia"/>
+          <w:b w:val="0"/>
+          <w:i w:val="0"/>
+          <w:color w:val="1C2027"/>
+          <w:sz w:val="21"/>
+        </w:rPr>
+        <w:t>de dialogue déjà authored dans le Catalogue.</w:t>
       </w:r>
     </w:p>
     <w:p>

</xml_diff>

<commit_message>
fix: make NPC exploration interactions playable (#187)
Les PNJ peuvent être traversés pendant un trajet, mais leur case ne peut pas être choisie comme destination.
Leur cadence passe de 850 ms à 1 800 ms, avec une animation plus lente et décalée.
Les PNJ disposant d’un dialogue dans le Catalog — notamment le Majordome — ouvrent désormais réellement leur dialogue.
Les choix utilisent un endpoint dédié aux PNJ physiques et appliquent leurs conséquences.
Les PNJ décoratifs sans contenu Catalog conservent un simple retour d’ambiance.
Aucun changement de base de données ni migration.
</commit_message>
<xml_diff>
--- a/docs/design/Sources/LEDS-SFD-EXP-001_Exploration_acteurs_et_declencheurs_v1.0.docx
+++ b/docs/design/Sources/LEDS-SFD-EXP-001_Exploration_acteurs_et_declencheurs_v1.0.docx
@@ -1757,7 +1757,39 @@
           <w:color w:val="1C2027"/>
           <w:sz w:val="21"/>
         </w:rPr>
-        <w:t>distance. Le joueur ne pénètre pas sur la case du PNJ.</w:t>
+        <w:t>distance. Une case occupée par un PNJ peut être traversée au milieu d'un</w:t>
+      </w:r>
+    </w:p>
+    <w:p>
+      <w:pPr>
+        <w:spacing w:after="100"/>
+        <w:ind w:left="0" w:firstLine="0"/>
+      </w:pPr>
+      <w:r>
+        <w:rPr>
+          <w:rFonts w:ascii="Georgia" w:hAnsi="Georgia"/>
+          <w:b w:val="0"/>
+          <w:i w:val="0"/>
+          <w:color w:val="1C2027"/>
+          <w:sz w:val="21"/>
+        </w:rPr>
+        <w:t>trajet afin de ne jamais condamner un couloir, mais elle ne peut pas être la</w:t>
+      </w:r>
+    </w:p>
+    <w:p>
+      <w:pPr>
+        <w:spacing w:after="100"/>
+        <w:ind w:left="0" w:firstLine="0"/>
+      </w:pPr>
+      <w:r>
+        <w:rPr>
+          <w:rFonts w:ascii="Georgia" w:hAnsi="Georgia"/>
+          <w:b w:val="0"/>
+          <w:i w:val="0"/>
+          <w:color w:val="1C2027"/>
+          <w:sz w:val="21"/>
+        </w:rPr>
+        <w:t>destination finale du joueur.</w:t>
       </w:r>
     </w:p>
     <w:p>
@@ -3465,6 +3497,58 @@
           <w:color w:val="1C2027"/>
           <w:sz w:val="21"/>
         </w:rPr>
+        <w:t>CA-EXP-003b</w:t>
+      </w:r>
+      <w:r>
+        <w:rPr>
+          <w:rFonts w:ascii="Georgia" w:hAnsi="Georgia"/>
+          <w:b w:val="0"/>
+          <w:i w:val="0"/>
+          <w:color w:val="1C2027"/>
+          <w:sz w:val="21"/>
+        </w:rPr>
+        <w:t xml:space="preserve"> — Une destination libre située derrière un PNJ dans un couloir</w:t>
+      </w:r>
+    </w:p>
+    <w:p>
+      <w:pPr>
+        <w:spacing w:after="100"/>
+        <w:ind w:left="0" w:firstLine="0"/>
+      </w:pPr>
+      <w:r>
+        <w:rPr>
+          <w:rFonts w:ascii="Georgia" w:hAnsi="Georgia"/>
+          <w:b w:val="0"/>
+          <w:i w:val="0"/>
+          <w:color w:val="1C2027"/>
+          <w:sz w:val="21"/>
+        </w:rPr>
+        <w:t>reste atteignable ; le trajet traverse la case occupée sans y terminer.</w:t>
+      </w:r>
+    </w:p>
+    <w:p>
+      <w:pPr>
+        <w:spacing w:after="100"/>
+        <w:ind w:left="317" w:hanging="202"/>
+      </w:pPr>
+      <w:r>
+        <w:rPr>
+          <w:rFonts w:ascii="Georgia" w:hAnsi="Georgia"/>
+          <w:b/>
+          <w:i w:val="0"/>
+          <w:color w:val="525C6C"/>
+          <w:sz w:val="20"/>
+        </w:rPr>
+        <w:t xml:space="preserve">—  </w:t>
+      </w:r>
+      <w:r>
+        <w:rPr>
+          <w:rFonts w:ascii="Georgia" w:hAnsi="Georgia"/>
+          <w:b/>
+          <w:i w:val="0"/>
+          <w:color w:val="1C2027"/>
+          <w:sz w:val="21"/>
+        </w:rPr>
         <w:t>CA-EXP-004</w:t>
       </w:r>
       <w:r>
@@ -3797,7 +3881,23 @@
           <w:color w:val="1C2027"/>
           <w:sz w:val="21"/>
         </w:rPr>
-        <w:t>Refonte des dialogues ou du contenu narratif des PNJ.</w:t>
+        <w:t>Réécriture du contenu narratif des PNJ ; l'interaction réutilise les graphes</w:t>
+      </w:r>
+    </w:p>
+    <w:p>
+      <w:pPr>
+        <w:spacing w:after="100"/>
+        <w:ind w:left="0" w:firstLine="0"/>
+      </w:pPr>
+      <w:r>
+        <w:rPr>
+          <w:rFonts w:ascii="Georgia" w:hAnsi="Georgia"/>
+          <w:b w:val="0"/>
+          <w:i w:val="0"/>
+          <w:color w:val="1C2027"/>
+          <w:sz w:val="21"/>
+        </w:rPr>
+        <w:t>de dialogue déjà authored dans le Catalogue.</w:t>
       </w:r>
     </w:p>
     <w:p>

</xml_diff>